<commit_message>
docs: PERT toan du an va cap nhat Sprint Planning, Review, Retrospective, Product Backlog theo PERT
PERT viet mot lan cho Sprint 1-6: moi Sprint = phan tich + cong viec + kiem thu + du phong (1,65 sigma), mot nguoi lam nen duong gang la ca chuoi. Quy tac tre han: dung du phong, het thi keo dai Sprint va doi Sprint sau, khong cat viec. Sprint 2 keo dai den 30/10/2026, US-13 hoan thanh trong Sprint 2; Sprint 3 bat dau 02/11/2026, du an ket thuc 19/01/2027. Bo PERT cu chi co Sprint 1-2.

Co-Authored-By: Claude Opus 5.5 <noreply@anthropic.com>
</commit_message>
<xml_diff>
--- a/docs/BaoCaoKiemThu_Sprint1-2.docx
+++ b/docs/BaoCaoKiemThu_Sprint1-2.docx
@@ -61,7 +61,7 @@
         <w:t>Sprint 2</w:t>
       </w:r>
       <w:r>
-        <w:t xml:space="preserve"> (US-05 → US-12: CI, đăng nhập, đăng ký, đăng xuất, phân quyền, quản lý người dùng, tuyến, khu vực, loại dịch vụ), cùng các hạng mục làm sớm: PB-01, PB-04 (khách vãng lai xem trang chủ, vùng phục vụ, bảng giá) và US-26 (đăng nhập ứng dụng di động).</w:t>
+        <w:t xml:space="preserve"> (US-05 → US-13: CI, đăng nhập, đăng ký, đăng xuất, phân quyền, quản lý người dùng, tuyến, khu vực, loại dịch vụ, bảng giá), cùng các hạng mục làm sớm: PB-01, PB-04 (khách vãng lai xem trang chủ, vùng phục vụ, bảng giá) và US-26 (đăng nhập ứng dụng di động).</w:t>
       </w:r>
     </w:p>
     <w:p>
@@ -124,7 +124,7 @@
         <w:spacing w:after="40" w:afterAutospacing="0"/>
       </w:pPr>
       <w:r>
-        <w:t>Ngoài phạm vi: các story chưa có mã nguồn (US-13 quản trị bảng giá trở đi) — tiêu chí của chúng nằm trong tests/stories-pending.test.js dạng test.todo.</w:t>
+        <w:t>Ngoài phạm vi: các story chưa có mã nguồn (US-14 trở đi) — tiêu chí của chúng nằm trong tests/stories-pending.test.js dạng test.todo.</w:t>
       </w:r>
     </w:p>
     <w:p>
@@ -706,7 +706,7 @@
                 <w:rFonts w:ascii="Times New Roman" w:hAnsi="Times New Roman" w:cs="Times New Roman" w:eastAsia="Times New Roman"/>
                 <w:sz w:val="20"/>
               </w:rPr>
-              <w:t>93</w:t>
+              <w:t>105</w:t>
             </w:r>
           </w:p>
         </w:tc>
@@ -724,7 +724,7 @@
                 <w:rFonts w:ascii="Times New Roman" w:hAnsi="Times New Roman" w:cs="Times New Roman" w:eastAsia="Times New Roman"/>
                 <w:sz w:val="20"/>
               </w:rPr>
-              <w:t>93</w:t>
+              <w:t>105</w:t>
             </w:r>
           </w:p>
         </w:tc>
@@ -926,7 +926,7 @@
                 <w:rFonts w:ascii="Times New Roman" w:hAnsi="Times New Roman" w:cs="Times New Roman" w:eastAsia="Times New Roman"/>
                 <w:sz w:val="20"/>
               </w:rPr>
-              <w:t>13</w:t>
+              <w:t>14</w:t>
             </w:r>
           </w:p>
         </w:tc>
@@ -944,7 +944,7 @@
                 <w:rFonts w:ascii="Times New Roman" w:hAnsi="Times New Roman" w:cs="Times New Roman" w:eastAsia="Times New Roman"/>
                 <w:sz w:val="20"/>
               </w:rPr>
-              <w:t>13</w:t>
+              <w:t>14</w:t>
             </w:r>
           </w:p>
         </w:tc>
@@ -1574,7 +1574,7 @@
                 <w:b/>
                 <w:sz w:val="20"/>
               </w:rPr>
-              <w:t>146</w:t>
+              <w:t>159</w:t>
             </w:r>
           </w:p>
         </w:tc>
@@ -1593,7 +1593,7 @@
                 <w:b/>
                 <w:sz w:val="20"/>
               </w:rPr>
-              <w:t>146</w:t>
+              <w:t>159</w:t>
             </w:r>
           </w:p>
         </w:tc>
@@ -1628,7 +1628,7 @@
         <w:spacing w:after="80" w:afterAutospacing="0"/>
       </w:pPr>
       <w:r>
-        <w:t>Bộ test API còn 34 ca dạng todo — tiêu chí của các story chưa làm (Sprint 3 trở đi), không phải lỗi. Lệnh chạy lại toàn bộ: code\test-song-song.ps1 (trình duyệt và máy ảo chạy đồng thời, sau đó tới kịch bản liên thiết bị) và npm test trong code/apps/api.</w:t>
+        <w:t>Bộ test API còn 30 ca dạng todo — tiêu chí của các story chưa làm (Sprint 3 trở đi), không phải lỗi. Lệnh chạy lại toàn bộ: code\test-song-song.ps1 (trình duyệt và máy ảo chạy đồng thời, sau đó tới kịch bản liên thiết bị) và npm test trong code/apps/api.</w:t>
       </w:r>
     </w:p>
     <w:p>
@@ -2646,6 +2646,82 @@
                 <w:sz w:val="20"/>
               </w:rPr>
               <w:t>3/3</w:t>
+            </w:r>
+          </w:p>
+        </w:tc>
+        <w:tc>
+          <w:tcPr>
+            <w:tcW w:type="dxa" w:w="1134"/>
+          </w:tcPr>
+          <w:p>
+            <w:pPr>
+              <w:spacing w:before="0" w:after="0" w:beforeAutospacing="0" w:afterAutospacing="0"/>
+              <w:jc w:val="center"/>
+            </w:pPr>
+            <w:r>
+              <w:rPr>
+                <w:rFonts w:ascii="Times New Roman" w:hAnsi="Times New Roman" w:cs="Times New Roman" w:eastAsia="Times New Roman"/>
+                <w:sz w:val="20"/>
+              </w:rPr>
+              <w:t>Đạt</w:t>
+            </w:r>
+          </w:p>
+        </w:tc>
+      </w:tr>
+      <w:tr>
+        <w:trPr>
+          <w:cantSplit/>
+        </w:trPr>
+        <w:tc>
+          <w:tcPr>
+            <w:tcW w:type="dxa" w:w="907"/>
+          </w:tcPr>
+          <w:p>
+            <w:pPr>
+              <w:spacing w:before="0" w:after="0" w:beforeAutospacing="0" w:afterAutospacing="0"/>
+              <w:jc w:val="center"/>
+            </w:pPr>
+            <w:r>
+              <w:rPr>
+                <w:rFonts w:ascii="Times New Roman" w:hAnsi="Times New Roman" w:cs="Times New Roman" w:eastAsia="Times New Roman"/>
+                <w:sz w:val="20"/>
+              </w:rPr>
+              <w:t>US-13</w:t>
+            </w:r>
+          </w:p>
+        </w:tc>
+        <w:tc>
+          <w:tcPr>
+            <w:tcW w:type="dxa" w:w="6236"/>
+          </w:tcPr>
+          <w:p>
+            <w:pPr>
+              <w:spacing w:before="0" w:after="0" w:beforeAutospacing="0" w:afterAutospacing="0"/>
+            </w:pPr>
+            <w:r>
+              <w:rPr>
+                <w:rFonts w:ascii="Times New Roman" w:hAnsi="Times New Roman" w:cs="Times New Roman" w:eastAsia="Times New Roman"/>
+                <w:sz w:val="20"/>
+              </w:rPr>
+              <w:t>Bảng giá: bậc khối lượng không chồng lấn/không hở (8 test ranh giới), không trùng khoảng hiệu lực, bảng giá đã dùng chỉ lùi ngày hết hiệu lực</w:t>
+            </w:r>
+          </w:p>
+        </w:tc>
+        <w:tc>
+          <w:tcPr>
+            <w:tcW w:type="dxa" w:w="1361"/>
+          </w:tcPr>
+          <w:p>
+            <w:pPr>
+              <w:spacing w:before="0" w:after="0" w:beforeAutospacing="0" w:afterAutospacing="0"/>
+              <w:jc w:val="center"/>
+            </w:pPr>
+            <w:r>
+              <w:rPr>
+                <w:rFonts w:ascii="Times New Roman" w:hAnsi="Times New Roman" w:cs="Times New Roman" w:eastAsia="Times New Roman"/>
+                <w:sz w:val="20"/>
+              </w:rPr>
+              <w:t>12/12</w:t>
             </w:r>
           </w:p>
         </w:tc>
@@ -4684,6 +4760,115 @@
                 <w:rFonts w:ascii="Times New Roman" w:hAnsi="Times New Roman" w:cs="Times New Roman" w:eastAsia="Times New Roman"/>
                 <w:sz w:val="19"/>
               </w:rPr>
+              <w:t>TC-14b</w:t>
+            </w:r>
+          </w:p>
+        </w:tc>
+        <w:tc>
+          <w:tcPr>
+            <w:tcW w:type="dxa" w:w="1247"/>
+          </w:tcPr>
+          <w:p>
+            <w:pPr>
+              <w:spacing w:before="0" w:after="0" w:beforeAutospacing="0" w:afterAutospacing="0"/>
+            </w:pPr>
+            <w:r>
+              <w:rPr>
+                <w:rFonts w:ascii="Times New Roman" w:hAnsi="Times New Roman" w:cs="Times New Roman" w:eastAsia="Times New Roman"/>
+                <w:sz w:val="19"/>
+              </w:rPr>
+              <w:t>ADMIN</w:t>
+            </w:r>
+          </w:p>
+        </w:tc>
+        <w:tc>
+          <w:tcPr>
+            <w:tcW w:type="dxa" w:w="2778"/>
+          </w:tcPr>
+          <w:p>
+            <w:pPr>
+              <w:spacing w:before="0" w:after="0" w:beforeAutospacing="0" w:afterAutospacing="0"/>
+            </w:pPr>
+            <w:r>
+              <w:rPr>
+                <w:rFonts w:ascii="Times New Roman" w:hAnsi="Times New Roman" w:cs="Times New Roman" w:eastAsia="Times New Roman"/>
+                <w:sz w:val="19"/>
+              </w:rPr>
+              <w:t>Thêm bảng giá có bậc chồng lấn, rồi bảng giá trùng khoảng hiệu lực</w:t>
+            </w:r>
+          </w:p>
+        </w:tc>
+        <w:tc>
+          <w:tcPr>
+            <w:tcW w:type="dxa" w:w="2835"/>
+          </w:tcPr>
+          <w:p>
+            <w:pPr>
+              <w:spacing w:before="0" w:after="0" w:beforeAutospacing="0" w:afterAutospacing="0"/>
+            </w:pPr>
+            <w:r>
+              <w:rPr>
+                <w:rFonts w:ascii="Times New Roman" w:hAnsi="Times New Roman" w:cs="Times New Roman" w:eastAsia="Times New Roman"/>
+                <w:sz w:val="19"/>
+              </w:rPr>
+              <w:t>Báo lỗi ngay trên form, không lưu</w:t>
+            </w:r>
+          </w:p>
+        </w:tc>
+        <w:tc>
+          <w:tcPr>
+            <w:tcW w:type="dxa" w:w="1474"/>
+          </w:tcPr>
+          <w:p>
+            <w:pPr>
+              <w:spacing w:before="0" w:after="0" w:beforeAutospacing="0" w:afterAutospacing="0"/>
+            </w:pPr>
+            <w:r>
+              <w:rPr>
+                <w:rFonts w:ascii="Times New Roman" w:hAnsi="Times New Roman" w:cs="Times New Roman" w:eastAsia="Times New Roman"/>
+                <w:sz w:val="19"/>
+              </w:rPr>
+              <w:t>Web</w:t>
+            </w:r>
+          </w:p>
+        </w:tc>
+        <w:tc>
+          <w:tcPr>
+            <w:tcW w:type="dxa" w:w="567"/>
+          </w:tcPr>
+          <w:p>
+            <w:pPr>
+              <w:spacing w:before="0" w:after="0" w:beforeAutospacing="0" w:afterAutospacing="0"/>
+              <w:jc w:val="center"/>
+            </w:pPr>
+            <w:r>
+              <w:rPr>
+                <w:rFonts w:ascii="Times New Roman" w:hAnsi="Times New Roman" w:cs="Times New Roman" w:eastAsia="Times New Roman"/>
+                <w:sz w:val="19"/>
+              </w:rPr>
+              <w:t>Đạt</w:t>
+            </w:r>
+          </w:p>
+        </w:tc>
+      </w:tr>
+      <w:tr>
+        <w:trPr>
+          <w:cantSplit/>
+        </w:trPr>
+        <w:tc>
+          <w:tcPr>
+            <w:tcW w:type="dxa" w:w="737"/>
+          </w:tcPr>
+          <w:p>
+            <w:pPr>
+              <w:spacing w:before="0" w:after="0" w:beforeAutospacing="0" w:afterAutospacing="0"/>
+              <w:jc w:val="center"/>
+            </w:pPr>
+            <w:r>
+              <w:rPr>
+                <w:rFonts w:ascii="Times New Roman" w:hAnsi="Times New Roman" w:cs="Times New Roman" w:eastAsia="Times New Roman"/>
+                <w:sz w:val="19"/>
+              </w:rPr>
               <w:t>TC-15</w:t>
             </w:r>
           </w:p>
@@ -7089,7 +7274,188 @@
                     <a:graphicData uri="http://schemas.openxmlformats.org/drawingml/2006/picture">
                       <pic:pic>
                         <pic:nvPicPr>
-                          <pic:cNvPr id="0" name="c05-vung-phuc-vu-tim-khong-dau.png"/>
+                          <pic:cNvPr id="0" name="c04-bang-gia-nhanh.png"/>
+                          <pic:cNvPicPr/>
+                        </pic:nvPicPr>
+                        <pic:blipFill>
+                          <a:blip r:embed="rId10"/>
+                          <a:stretch>
+                            <a:fillRect/>
+                          </a:stretch>
+                        </pic:blipFill>
+                        <pic:spPr>
+                          <a:xfrm>
+                            <a:off x="0" y="0"/>
+                            <a:ext cx="1332000" cy="2960000"/>
+                          </a:xfrm>
+                          <a:prstGeom prst="rect"/>
+                        </pic:spPr>
+                      </pic:pic>
+                    </a:graphicData>
+                  </a:graphic>
+                </wp:inline>
+              </w:drawing>
+            </w:r>
+          </w:p>
+        </w:tc>
+        <w:tc>
+          <w:tcPr>
+            <w:tcW w:type="dxa" w:w="2409"/>
+          </w:tcPr>
+          <w:p>
+            <w:pPr>
+              <w:jc w:val="center"/>
+            </w:pPr>
+            <w:r>
+              <w:drawing>
+                <wp:inline xmlns:a="http://schemas.openxmlformats.org/drawingml/2006/main" xmlns:pic="http://schemas.openxmlformats.org/drawingml/2006/picture">
+                  <wp:extent cx="1332000" cy="2960000"/>
+                  <wp:docPr id="4" name="Picture 4"/>
+                  <wp:cNvGraphicFramePr>
+                    <a:graphicFrameLocks noChangeAspect="1"/>
+                  </wp:cNvGraphicFramePr>
+                  <a:graphic>
+                    <a:graphicData uri="http://schemas.openxmlformats.org/drawingml/2006/picture">
+                      <pic:pic>
+                        <pic:nvPicPr>
+                          <pic:cNvPr id="0" name="c04-bang-gia-nhanh.png"/>
+                          <pic:cNvPicPr/>
+                        </pic:nvPicPr>
+                        <pic:blipFill>
+                          <a:blip r:embed="rId10"/>
+                          <a:stretch>
+                            <a:fillRect/>
+                          </a:stretch>
+                        </pic:blipFill>
+                        <pic:spPr>
+                          <a:xfrm>
+                            <a:off x="0" y="0"/>
+                            <a:ext cx="1332000" cy="2960000"/>
+                          </a:xfrm>
+                          <a:prstGeom prst="rect"/>
+                        </pic:spPr>
+                      </pic:pic>
+                    </a:graphicData>
+                  </a:graphic>
+                </wp:inline>
+              </w:drawing>
+            </w:r>
+          </w:p>
+        </w:tc>
+      </w:tr>
+      <w:tr>
+        <w:tc>
+          <w:tcPr>
+            <w:tcW w:type="dxa" w:w="2409"/>
+          </w:tcPr>
+          <w:p>
+            <w:pPr>
+              <w:spacing w:before="40" w:after="80" w:beforeAutospacing="0" w:afterAutospacing="0"/>
+              <w:jc w:val="center"/>
+            </w:pPr>
+            <w:r>
+              <w:rPr>
+                <w:i/>
+                <w:sz w:val="19"/>
+              </w:rPr>
+              <w:t>Trang chủ khách vãng lai</w:t>
+            </w:r>
+          </w:p>
+        </w:tc>
+        <w:tc>
+          <w:tcPr>
+            <w:tcW w:type="dxa" w:w="2409"/>
+          </w:tcPr>
+          <w:p>
+            <w:pPr>
+              <w:spacing w:before="40" w:after="80" w:beforeAutospacing="0" w:afterAutospacing="0"/>
+              <w:jc w:val="center"/>
+            </w:pPr>
+            <w:r>
+              <w:rPr>
+                <w:i/>
+                <w:sz w:val="19"/>
+              </w:rPr>
+              <w:t>Bảng giá — Giao hàng nhanh</w:t>
+            </w:r>
+          </w:p>
+        </w:tc>
+        <w:tc>
+          <w:tcPr>
+            <w:tcW w:type="dxa" w:w="2409"/>
+          </w:tcPr>
+          <w:p>
+            <w:pPr>
+              <w:spacing w:before="40" w:after="80" w:beforeAutospacing="0" w:afterAutospacing="0"/>
+              <w:jc w:val="center"/>
+            </w:pPr>
+            <w:r>
+              <w:rPr>
+                <w:i/>
+                <w:sz w:val="19"/>
+              </w:rPr>
+              <w:t>Tìm không dấu “hoan kiem”</w:t>
+            </w:r>
+          </w:p>
+        </w:tc>
+        <w:tc>
+          <w:tcPr>
+            <w:tcW w:type="dxa" w:w="2409"/>
+          </w:tcPr>
+          <w:p>
+            <w:pPr>
+              <w:spacing w:before="40" w:after="80" w:beforeAutospacing="0" w:afterAutospacing="0"/>
+              <w:jc w:val="center"/>
+            </w:pPr>
+            <w:r>
+              <w:rPr>
+                <w:i/>
+                <w:sz w:val="19"/>
+              </w:rPr>
+              <w:t>Sai mật khẩu — báo lỗi</w:t>
+            </w:r>
+          </w:p>
+        </w:tc>
+      </w:tr>
+    </w:tbl>
+    <w:p>
+      <w:pPr>
+        <w:spacing w:before="0" w:after="80" w:beforeAutospacing="0" w:afterAutospacing="0"/>
+      </w:pPr>
+    </w:p>
+    <w:tbl>
+      <w:tblPr>
+        <w:tblW w:type="auto" w:w="0"/>
+        <w:tblLook w:firstColumn="1" w:firstRow="1" w:lastColumn="0" w:lastRow="0" w:noHBand="0" w:noVBand="1" w:val="04A0"/>
+      </w:tblPr>
+      <w:tblGrid>
+        <w:gridCol w:w="2409"/>
+        <w:gridCol w:w="2409"/>
+        <w:gridCol w:w="2409"/>
+        <w:gridCol w:w="2409"/>
+      </w:tblGrid>
+      <w:tr>
+        <w:tc>
+          <w:tcPr>
+            <w:tcW w:type="dxa" w:w="2409"/>
+          </w:tcPr>
+          <w:p>
+            <w:pPr>
+              <w:jc w:val="center"/>
+            </w:pPr>
+            <w:r>
+              <w:drawing>
+                <wp:inline xmlns:a="http://schemas.openxmlformats.org/drawingml/2006/main" xmlns:pic="http://schemas.openxmlformats.org/drawingml/2006/picture">
+                  <wp:extent cx="1332000" cy="2960000"/>
+                  <wp:docPr id="5" name="Picture 5"/>
+                  <wp:cNvGraphicFramePr>
+                    <a:graphicFrameLocks noChangeAspect="1"/>
+                  </wp:cNvGraphicFramePr>
+                  <a:graphic>
+                    <a:graphicData uri="http://schemas.openxmlformats.org/drawingml/2006/picture">
+                      <pic:pic>
+                        <pic:nvPicPr>
+                          <pic:cNvPr id="0" name="c13a-o-nhap-tren-ban-phim.png"/>
                           <pic:cNvPicPr/>
                         </pic:nvPicPr>
                         <pic:blipFill>
@@ -7125,7 +7491,7 @@
               <w:drawing>
                 <wp:inline xmlns:a="http://schemas.openxmlformats.org/drawingml/2006/main" xmlns:pic="http://schemas.openxmlformats.org/drawingml/2006/picture">
                   <wp:extent cx="1332000" cy="2960000"/>
-                  <wp:docPr id="4" name="Picture 4"/>
+                  <wp:docPr id="6" name="Picture 6"/>
                   <wp:cNvGraphicFramePr>
                     <a:graphicFrameLocks noChangeAspect="1"/>
                   </wp:cNvGraphicFramePr>
@@ -7133,7 +7499,51 @@
                     <a:graphicData uri="http://schemas.openxmlformats.org/drawingml/2006/picture">
                       <pic:pic>
                         <pic:nvPicPr>
-                          <pic:cNvPr id="0" name="c10-sai-mat-khau.png"/>
+                          <pic:cNvPr id="0" name="c04-bang-gia-nhanh.png"/>
+                          <pic:cNvPicPr/>
+                        </pic:nvPicPr>
+                        <pic:blipFill>
+                          <a:blip r:embed="rId10"/>
+                          <a:stretch>
+                            <a:fillRect/>
+                          </a:stretch>
+                        </pic:blipFill>
+                        <pic:spPr>
+                          <a:xfrm>
+                            <a:off x="0" y="0"/>
+                            <a:ext cx="1332000" cy="2960000"/>
+                          </a:xfrm>
+                          <a:prstGeom prst="rect"/>
+                        </pic:spPr>
+                      </pic:pic>
+                    </a:graphicData>
+                  </a:graphic>
+                </wp:inline>
+              </w:drawing>
+            </w:r>
+          </w:p>
+        </w:tc>
+        <w:tc>
+          <w:tcPr>
+            <w:tcW w:type="dxa" w:w="2409"/>
+          </w:tcPr>
+          <w:p>
+            <w:pPr>
+              <w:jc w:val="center"/>
+            </w:pPr>
+            <w:r>
+              <w:drawing>
+                <wp:inline xmlns:a="http://schemas.openxmlformats.org/drawingml/2006/main" xmlns:pic="http://schemas.openxmlformats.org/drawingml/2006/picture">
+                  <wp:extent cx="1332000" cy="2960000"/>
+                  <wp:docPr id="7" name="Picture 7"/>
+                  <wp:cNvGraphicFramePr>
+                    <a:graphicFrameLocks noChangeAspect="1"/>
+                  </wp:cNvGraphicFramePr>
+                  <a:graphic>
+                    <a:graphicData uri="http://schemas.openxmlformats.org/drawingml/2006/picture">
+                      <pic:pic>
+                        <pic:nvPicPr>
+                          <pic:cNvPr id="0" name="03-admin-trang-chu.png"/>
                           <pic:cNvPicPr/>
                         </pic:nvPicPr>
                         <pic:blipFill>
@@ -7157,231 +7567,6 @@
             </w:r>
           </w:p>
         </w:tc>
-      </w:tr>
-      <w:tr>
-        <w:tc>
-          <w:tcPr>
-            <w:tcW w:type="dxa" w:w="2409"/>
-          </w:tcPr>
-          <w:p>
-            <w:pPr>
-              <w:spacing w:before="40" w:after="80" w:beforeAutospacing="0" w:afterAutospacing="0"/>
-              <w:jc w:val="center"/>
-            </w:pPr>
-            <w:r>
-              <w:rPr>
-                <w:i/>
-                <w:sz w:val="19"/>
-              </w:rPr>
-              <w:t>Trang chủ khách vãng lai</w:t>
-            </w:r>
-          </w:p>
-        </w:tc>
-        <w:tc>
-          <w:tcPr>
-            <w:tcW w:type="dxa" w:w="2409"/>
-          </w:tcPr>
-          <w:p>
-            <w:pPr>
-              <w:spacing w:before="40" w:after="80" w:beforeAutospacing="0" w:afterAutospacing="0"/>
-              <w:jc w:val="center"/>
-            </w:pPr>
-            <w:r>
-              <w:rPr>
-                <w:i/>
-                <w:sz w:val="19"/>
-              </w:rPr>
-              <w:t>Bảng giá — Giao hàng nhanh</w:t>
-            </w:r>
-          </w:p>
-        </w:tc>
-        <w:tc>
-          <w:tcPr>
-            <w:tcW w:type="dxa" w:w="2409"/>
-          </w:tcPr>
-          <w:p>
-            <w:pPr>
-              <w:spacing w:before="40" w:after="80" w:beforeAutospacing="0" w:afterAutospacing="0"/>
-              <w:jc w:val="center"/>
-            </w:pPr>
-            <w:r>
-              <w:rPr>
-                <w:i/>
-                <w:sz w:val="19"/>
-              </w:rPr>
-              <w:t>Tìm không dấu “hoan kiem”</w:t>
-            </w:r>
-          </w:p>
-        </w:tc>
-        <w:tc>
-          <w:tcPr>
-            <w:tcW w:type="dxa" w:w="2409"/>
-          </w:tcPr>
-          <w:p>
-            <w:pPr>
-              <w:spacing w:before="40" w:after="80" w:beforeAutospacing="0" w:afterAutospacing="0"/>
-              <w:jc w:val="center"/>
-            </w:pPr>
-            <w:r>
-              <w:rPr>
-                <w:i/>
-                <w:sz w:val="19"/>
-              </w:rPr>
-              <w:t>Sai mật khẩu — báo lỗi</w:t>
-            </w:r>
-          </w:p>
-        </w:tc>
-      </w:tr>
-    </w:tbl>
-    <w:p>
-      <w:pPr>
-        <w:spacing w:before="0" w:after="80" w:beforeAutospacing="0" w:afterAutospacing="0"/>
-      </w:pPr>
-    </w:p>
-    <w:tbl>
-      <w:tblPr>
-        <w:tblW w:type="auto" w:w="0"/>
-        <w:tblLook w:firstColumn="1" w:firstRow="1" w:lastColumn="0" w:lastRow="0" w:noHBand="0" w:noVBand="1" w:val="04A0"/>
-      </w:tblPr>
-      <w:tblGrid>
-        <w:gridCol w:w="2409"/>
-        <w:gridCol w:w="2409"/>
-        <w:gridCol w:w="2409"/>
-        <w:gridCol w:w="2409"/>
-      </w:tblGrid>
-      <w:tr>
-        <w:tc>
-          <w:tcPr>
-            <w:tcW w:type="dxa" w:w="2409"/>
-          </w:tcPr>
-          <w:p>
-            <w:pPr>
-              <w:jc w:val="center"/>
-            </w:pPr>
-            <w:r>
-              <w:drawing>
-                <wp:inline xmlns:a="http://schemas.openxmlformats.org/drawingml/2006/main" xmlns:pic="http://schemas.openxmlformats.org/drawingml/2006/picture">
-                  <wp:extent cx="1332000" cy="2960000"/>
-                  <wp:docPr id="5" name="Picture 5"/>
-                  <wp:cNvGraphicFramePr>
-                    <a:graphicFrameLocks noChangeAspect="1"/>
-                  </wp:cNvGraphicFramePr>
-                  <a:graphic>
-                    <a:graphicData uri="http://schemas.openxmlformats.org/drawingml/2006/picture">
-                      <pic:pic>
-                        <pic:nvPicPr>
-                          <pic:cNvPr id="0" name="c13a-o-nhap-tren-ban-phim.png"/>
-                          <pic:cNvPicPr/>
-                        </pic:nvPicPr>
-                        <pic:blipFill>
-                          <a:blip r:embed="rId13"/>
-                          <a:stretch>
-                            <a:fillRect/>
-                          </a:stretch>
-                        </pic:blipFill>
-                        <pic:spPr>
-                          <a:xfrm>
-                            <a:off x="0" y="0"/>
-                            <a:ext cx="1332000" cy="2960000"/>
-                          </a:xfrm>
-                          <a:prstGeom prst="rect"/>
-                        </pic:spPr>
-                      </pic:pic>
-                    </a:graphicData>
-                  </a:graphic>
-                </wp:inline>
-              </w:drawing>
-            </w:r>
-          </w:p>
-        </w:tc>
-        <w:tc>
-          <w:tcPr>
-            <w:tcW w:type="dxa" w:w="2409"/>
-          </w:tcPr>
-          <w:p>
-            <w:pPr>
-              <w:jc w:val="center"/>
-            </w:pPr>
-            <w:r>
-              <w:drawing>
-                <wp:inline xmlns:a="http://schemas.openxmlformats.org/drawingml/2006/main" xmlns:pic="http://schemas.openxmlformats.org/drawingml/2006/picture">
-                  <wp:extent cx="1332000" cy="2960000"/>
-                  <wp:docPr id="6" name="Picture 6"/>
-                  <wp:cNvGraphicFramePr>
-                    <a:graphicFrameLocks noChangeAspect="1"/>
-                  </wp:cNvGraphicFramePr>
-                  <a:graphic>
-                    <a:graphicData uri="http://schemas.openxmlformats.org/drawingml/2006/picture">
-                      <pic:pic>
-                        <pic:nvPicPr>
-                          <pic:cNvPr id="0" name="c13-dang-ky-trung-email.png"/>
-                          <pic:cNvPicPr/>
-                        </pic:nvPicPr>
-                        <pic:blipFill>
-                          <a:blip r:embed="rId14"/>
-                          <a:stretch>
-                            <a:fillRect/>
-                          </a:stretch>
-                        </pic:blipFill>
-                        <pic:spPr>
-                          <a:xfrm>
-                            <a:off x="0" y="0"/>
-                            <a:ext cx="1332000" cy="2960000"/>
-                          </a:xfrm>
-                          <a:prstGeom prst="rect"/>
-                        </pic:spPr>
-                      </pic:pic>
-                    </a:graphicData>
-                  </a:graphic>
-                </wp:inline>
-              </w:drawing>
-            </w:r>
-          </w:p>
-        </w:tc>
-        <w:tc>
-          <w:tcPr>
-            <w:tcW w:type="dxa" w:w="2409"/>
-          </w:tcPr>
-          <w:p>
-            <w:pPr>
-              <w:jc w:val="center"/>
-            </w:pPr>
-            <w:r>
-              <w:drawing>
-                <wp:inline xmlns:a="http://schemas.openxmlformats.org/drawingml/2006/main" xmlns:pic="http://schemas.openxmlformats.org/drawingml/2006/picture">
-                  <wp:extent cx="1332000" cy="2960000"/>
-                  <wp:docPr id="7" name="Picture 7"/>
-                  <wp:cNvGraphicFramePr>
-                    <a:graphicFrameLocks noChangeAspect="1"/>
-                  </wp:cNvGraphicFramePr>
-                  <a:graphic>
-                    <a:graphicData uri="http://schemas.openxmlformats.org/drawingml/2006/picture">
-                      <pic:pic>
-                        <pic:nvPicPr>
-                          <pic:cNvPr id="0" name="03-admin-trang-chu.png"/>
-                          <pic:cNvPicPr/>
-                        </pic:nvPicPr>
-                        <pic:blipFill>
-                          <a:blip r:embed="rId15"/>
-                          <a:stretch>
-                            <a:fillRect/>
-                          </a:stretch>
-                        </pic:blipFill>
-                        <pic:spPr>
-                          <a:xfrm>
-                            <a:off x="0" y="0"/>
-                            <a:ext cx="1332000" cy="2960000"/>
-                          </a:xfrm>
-                          <a:prstGeom prst="rect"/>
-                        </pic:spPr>
-                      </pic:pic>
-                    </a:graphicData>
-                  </a:graphic>
-                </wp:inline>
-              </w:drawing>
-            </w:r>
-          </w:p>
-        </w:tc>
         <w:tc>
           <w:tcPr>
             <w:tcW w:type="dxa" w:w="2409"/>
@@ -7402,11 +7587,11 @@
                     <a:graphicData uri="http://schemas.openxmlformats.org/drawingml/2006/picture">
                       <pic:pic>
                         <pic:nvPicPr>
-                          <pic:cNvPr id="0" name="05-tai-xe-trang-chu.png"/>
+                          <pic:cNvPr id="0" name="c04-bang-gia-nhanh.png"/>
                           <pic:cNvPicPr/>
                         </pic:nvPicPr>
                         <pic:blipFill>
-                          <a:blip r:embed="rId16"/>
+                          <a:blip r:embed="rId10"/>
                           <a:stretch>
                             <a:fillRect/>
                           </a:stretch>
@@ -7559,7 +7744,7 @@
                           <pic:cNvPicPr/>
                         </pic:nvPicPr>
                         <pic:blipFill>
-                          <a:blip r:embed="rId17"/>
+                          <a:blip r:embed="rId13"/>
                           <a:stretch>
                             <a:fillRect/>
                           </a:stretch>
@@ -7603,7 +7788,7 @@
                           <pic:cNvPicPr/>
                         </pic:nvPicPr>
                         <pic:blipFill>
-                          <a:blip r:embed="rId18"/>
+                          <a:blip r:embed="rId14"/>
                           <a:stretch>
                             <a:fillRect/>
                           </a:stretch>
@@ -7647,7 +7832,7 @@
                           <pic:cNvPicPr/>
                         </pic:nvPicPr>
                         <pic:blipFill>
-                          <a:blip r:embed="rId19"/>
+                          <a:blip r:embed="rId15"/>
                           <a:stretch>
                             <a:fillRect/>
                           </a:stretch>
@@ -7691,7 +7876,7 @@
                           <pic:cNvPicPr/>
                         </pic:nvPicPr>
                         <pic:blipFill>
-                          <a:blip r:embed="rId20"/>
+                          <a:blip r:embed="rId16"/>
                           <a:stretch>
                             <a:fillRect/>
                           </a:stretch>
@@ -7809,7 +7994,7 @@
         <w:rPr>
           <w:b/>
         </w:rPr>
-        <w:t>146/146 ca kiểm thử đạt, 0 lỗi còn mở</w:t>
+        <w:t>159/159 ca kiểm thử đạt, 0 lỗi còn mở</w:t>
       </w:r>
       <w:r>
         <w:t xml:space="preserve"> trên cả ba ứng dụng và API. Các thao tác người dùng của Sprint 1 – 2 chạy đúng trên trình duyệt và trên điện thoại Android.</w:t>

</xml_diff>